<commit_message>
Shorten the abstract to exemplar length
Cuts the abstract from 444 to 230 words, matching the ~200-word length of
the reference submissions. Keeps the five-move shape (problem, gap,
what was built, numeric results including the negative ones, what they
license) and the four headline findings; drops the model inventory and
the experiment-by-experiment recital, both of which Sections III and IV
already carry.

Co-Authored-By: Claude Opus 5 <noreply@anthropic.com>
Claude-Session: https://claude.ai/code/session_01HkkBxSJKEdB6STiXiiZ49K
</commit_message>
<xml_diff>
--- a/docs/paper/conference_paper.docx
+++ b/docs/paper/conference_paper.docx
@@ -50,16 +50,7 @@
         <w:pStyle w:val="Abstract"/>
       </w:pPr>
       <w:r>
-        <w:t xml:space="preserve">Community-television archives hold thousands of hours of long-form programming with no segment-level index, so nothing </w:t>
-      </w:r>
-      <w:r>
-        <w:rPr>
-          <w:i/>
-        </w:rPr>
-        <w:t xml:space="preserve">inside</w:t>
-      </w:r>
-      <w:r>
-        <w:t xml:space="preserve"> a programme is searchable. Automatic metadata generation is the obvious remedy, but the standard evaluation route — annotate a sample by hand, report accuracy — was unavailable for this corpus, and single-model pipelines publish confident output with no indication of which fields can be trusted. This work builds a reliability-aware metadata pipeline for the NVTV public archive that treats corroboration between independent model families as a first-class output alongside the metadata itself. Forty-seven archival programmes were segmented into 626 fixed 30-second clips and annotated across five fields (transcript, on-screen text, keywords, visual tags, people count) by heterogeneous pretrained families: Whisper-small and Whisper-turbo for speech; Tesseract and EasyOCR for on-screen text; KeyBERT, YAKE and TF-IDF for keywords; CLIP ViT-B/32 and ViT-L/14 for a 34-label controlled vocabulary; and BLIP-VQA, ViLT-VQA and DETR for people count, with a hosted multimodal annotator as an optional additional family. Every published field carries an evidence status, the set of models supporting it, and a cross-source agreement score that explicitly excludes self-similarity and never promotes empty output. Four experiments probe the design: a frame-sampling ablation on a frozen calibration subset, a perturbation-based robustness study, an ablation isolating what the hosted annotator contributes, and a benchmark of seven open-weight vision-language models (Qwen3-VL 2B/4B/8B in Instruct and Thinking variants, InternVL3-2B and -8B) scored against the pipeline's consensus over 615 clips and 21,140 (model, clip, field) scores. The results are mixed in an informative way. Scene-aware sampling recovered 23.0 OCR items per clip against 14.5 for the centre frame and 3.0 for fixed three-frame sampling, but its outputs agreed with the centre-frame baseline only 0.53 of the time, so added coverage and stability trade directly against each other. Robustness is strongly field-dependent: under Gaussian blur, visual-tag stability held at 0.96 while OCR stability collapsed to 0.07. The hosted annotator changed the published visual tags on 49.0% of clips despite agreeing with the local consensus only 0.42 of the time, and — by design — changed the published on-screen text on 0.0% of clips, because strict dual-engine OCR consensus is not overridable. In the VLM benchmark, InternVL3-2B led on on-screen text (0.566 ROUGE-L recall), visual tags (0.895 accuracy) and people count (0.404 accuracy), beating both 8B models; and every model scored at or near zero on transcript (best 0.034, worst 0.000), with Qwen3-VL-4B-Instruct returning an empty transcript on 613 of 615 clips. Scale did not predict quality on any field. The contribution is a reproducible, audit-ready silver-standard pipeline whose reliability signals are explicit, together with the negative and null results that delimit what such a pipeline can honestly claim.</w:t>
+        <w:t xml:space="preserve">Community-television archives hold thousands of hours of programming with no segment-level index, so nothing inside a programme is searchable. Automatic description is the obvious remedy, but the standard evaluation route — annotate a sample by hand — was unavailable for this corpus, and single-model pipelines publish output with no indication of which fields can be trusted. This work builds a metadata pipeline for the NVTV public archive in which corroboration between independent model families is a published output alongside the metadata itself. Forty-seven archival programmes were segmented into 626 fixed 30-second clips and annotated across five fields by heterogeneous pretrained families, every field carrying an evidence status, its supporting models, and an agreement score that excludes self-similarity and never promotes empty output. Scene-aware sampling recovered 23.0 on-screen-text items per clip against 14.5 for the centre frame, yet agreed with that baseline only 0.53 of the time. Under blur, visual-tag stability held at 0.96 while text stability fell to 0.07. A hosted multimodal annotator rewrote 49.0% of visual-tag sets while agreeing with the local consensus 0.42 of the time, and changed 0.0% of on-screen text, which strict dual-engine consensus vetoes by design. Across seven open-weight vision-language models and 21,140 scores, a 2B model led three of five fields and every model scored at or near zero on transcript. Reliability is a per-field property, and corroboration is reported as corroboration, not correctness.</w:t>
       </w:r>
     </w:p>
     <w:p>

</xml_diff>

<commit_message>
Correct the temporal-localisation claim
The scope note said the OCR frame offsets are discarded. They are not:
transcribe_clip stores each Whisper segment with start and end times, and
the OCR consensus stores frames_detected per accepted string. Both reach
the per-clip prediction records; only the focused five-field export leaves
them out.

The boundary still holds — the published record is clip-granular — but the
reason is an export choice rather than lost information, so future work now
lists surfacing that timing as an export change rather than new inference.

Co-Authored-By: Claude Opus 5 <noreply@anthropic.com>
Claude-Session: https://claude.ai/code/session_01HkkBxSJKEdB6STiXiiZ49K
</commit_message>
<xml_diff>
--- a/docs/paper/conference_paper.docx
+++ b/docs/paper/conference_paper.docx
@@ -323,7 +323,7 @@
         <w:t xml:space="preserve">No temporal localisation within a clip.</w:t>
       </w:r>
       <w:r>
-        <w:t xml:space="preserve"> Every field is published at clip granularity. The record states that a caption, a speaker or an activity is present in a given 30 seconds, never where inside it. On-screen text is probed densely across frames, but the persistence rule collapses the result to one clip-level list and the frame offsets are discarded.</w:t>
+        <w:t xml:space="preserve"> Every field is published at clip granularity: the record states that a caption, a speaker or an activity is present in a given 30 seconds, never where inside it. The underlying timing is computed and retained in the prediction records — Whisper segments carry start and end times, and each accepted on-screen-text string carries the frame indices it was detected in — but the published five-field record does not expose it.</w:t>
       </w:r>
     </w:p>
     <w:p>
@@ -5226,7 +5226,7 @@
         <w:t xml:space="preserve">Future work.</w:t>
       </w:r>
       <w:r>
-        <w:t xml:space="preserve"> (i) Collect a small human-annotated reference — a few hundred clips is enough — which converts every agreement number here into a validity measurement and settles the RQ4 tag question. (ii) Replace equal family weights with measured per-source reliability, for which the provenance machinery is already in place. (iii) Add an audio-capable multimodal model to the benchmark, so the transcript column tests a model that was given the information the task requires. (iv) Scale the ablations past 8 and 5 clips. (v) Gate the ASR stage on Whisper's own language-identification output, so that a mis-identified clip is flagged rather than propagated into the transcript-derived keyword field. (vi) Test shot-boundary clip segmentation against the fixed 30-second grid. (vii) Add diarisation, which would let the transcript field carry speaker turns and would give the people-count field a second, audio-side source to be corroborated against.</w:t>
+        <w:t xml:space="preserve"> (i) Collect a small human-annotated reference — a few hundred clips is enough — which converts every agreement number here into a validity measurement and settles the RQ4 tag question. (ii) Replace equal family weights with measured per-source reliability, for which the provenance machinery is already in place. (iii) Add an audio-capable multimodal model to the benchmark, so the transcript column tests a model that was given the information the task requires. (iv) Scale the ablations past 8 and 5 clips. (v) Gate the ASR stage on Whisper's own language-identification output, so that a mis-identified clip is flagged rather than propagated into the transcript-derived keyword field. (vi) Test shot-boundary clip segmentation against the fixed 30-second grid. (vii) Surface the sub-clip timing the pipeline already records — Whisper segment boundaries and per-string OCR frame indices — in the published record, which needs an export change rather than new inference and would let a user land on the second rather than the half-minute. (viii) Add diarisation, which would let the transcript field carry speaker turns and would give people count a second, audio-side source to corroborate against its four visual ones.</w:t>
       </w:r>
     </w:p>
     <w:p>

</xml_diff>

<commit_message>
Correct the clips-per-programme range and fill the corpus statistics
The range was recorded as 10-22 from a truncated manifest listing. The full
listing gives 8-22: the two shortest programmes, REFRESH - PSNI Young
Digital Team (8 clips) and Adrian Ismay Vigil (9), fell outside the visible
rows.

Table I now carries the mean, median and SD (13.3 / 12 / 3.1), the clip
counts per split (123 / 503) alongside the programme counts, and a bounded
corpus duration. The split row is relabelled "programmes", since 9 / 38
counts source videos and reads as a clip count next to the 626 above it.

The exact duration stays open: 626 x 30 s is an upper bound because each
programme's final fragment may be short, so the true value is between
4.85 h and 5.22 h and needs the ffprobe sum.

Co-Authored-By: Claude Opus 5 <noreply@anthropic.com>
Claude-Session: https://claude.ai/code/session_01HkkBxSJKEdB6STiXiiZ49K
</commit_message>
<xml_diff>
--- a/docs/paper/conference_paper.docx
+++ b/docs/paper/conference_paper.docx
@@ -585,7 +585,7 @@
         <w:pStyle w:val="BodyText"/>
       </w:pPr>
       <w:r>
-        <w:t xml:space="preserve">Sources — not clips — are split, 9 to calibration and 38 to evaluation, so no programme contributes clips to both sides. The calibration split is the only material inspected while choosing sampling policy and thresholds.</w:t>
+        <w:t xml:space="preserve">Sources — not clips — are split, 9 programmes (123 clips) to calibration and 38 (503 clips) to evaluation, so no programme contributes clips to both sides. The split is a seeded permutation of the sorted source identifiers at a configured calibration fraction of 0.20, and is therefore deterministic across runs. The calibration split is the only material inspected while choosing sampling policy and thresholds.</w:t>
       </w:r>
     </w:p>
     <w:p>
@@ -801,7 +801,7 @@
               <w:pStyle w:val="tablecopy"/>
             </w:pPr>
             <w:r>
-              <w:t xml:space="preserve">Calibration / evaluation sources</w:t>
+              <w:t xml:space="preserve">Calibration / evaluation programmes</w:t>
             </w:r>
           </w:p>
         </w:tc>
@@ -835,7 +835,7 @@
               <w:pStyle w:val="tablecopy"/>
             </w:pPr>
             <w:r>
-              <w:t xml:space="preserve">Clips scored in the VLM benchmark</w:t>
+              <w:t xml:space="preserve">Calibration / evaluation clips</w:t>
             </w:r>
           </w:p>
         </w:tc>
@@ -849,7 +849,7 @@
               <w:pStyle w:val="tablecopy"/>
             </w:pPr>
             <w:r>
-              <w:t xml:space="preserve">626</w:t>
+              <w:t xml:space="preserve">123 / 503 (19.6% / 80.4%)</w:t>
             </w:r>
           </w:p>
         </w:tc>
@@ -869,7 +869,7 @@
               <w:pStyle w:val="tablecopy"/>
             </w:pPr>
             <w:r>
-              <w:t xml:space="preserve">Clips per programme (range)</w:t>
+              <w:t xml:space="preserve">Clips scored in the VLM benchmark</w:t>
             </w:r>
           </w:p>
         </w:tc>
@@ -883,7 +883,75 @@
               <w:pStyle w:val="tablecopy"/>
             </w:pPr>
             <w:r>
-              <w:t xml:space="preserve">10 – 22</w:t>
+              <w:t xml:space="preserve">626</w:t>
+            </w:r>
+          </w:p>
+        </w:tc>
+      </w:tr>
+      <w:tr>
+        <w:trPr>
+          <w:cantSplit/>
+          <w:jc w:val="center"/>
+        </w:trPr>
+        <w:tc>
+          <w:tcPr>
+            <w:tcW w:w="2340" w:type="dxa"/>
+            <w:vAlign w:val="center"/>
+          </w:tcPr>
+          <w:p>
+            <w:pPr>
+              <w:pStyle w:val="tablecopy"/>
+            </w:pPr>
+            <w:r>
+              <w:t xml:space="preserve">Clips per programme</w:t>
+            </w:r>
+          </w:p>
+        </w:tc>
+        <w:tc>
+          <w:tcPr>
+            <w:tcW w:w="2340" w:type="dxa"/>
+            <w:vAlign w:val="center"/>
+          </w:tcPr>
+          <w:p>
+            <w:pPr>
+              <w:pStyle w:val="tablecopy"/>
+            </w:pPr>
+            <w:r>
+              <w:t xml:space="preserve">8 – 22 (mean 13.3, median 12, SD 3.1)</w:t>
+            </w:r>
+          </w:p>
+        </w:tc>
+      </w:tr>
+      <w:tr>
+        <w:trPr>
+          <w:cantSplit/>
+          <w:jc w:val="center"/>
+        </w:trPr>
+        <w:tc>
+          <w:tcPr>
+            <w:tcW w:w="2340" w:type="dxa"/>
+            <w:vAlign w:val="center"/>
+          </w:tcPr>
+          <w:p>
+            <w:pPr>
+              <w:pStyle w:val="tablecopy"/>
+            </w:pPr>
+            <w:r>
+              <w:t xml:space="preserve">Total clip duration</w:t>
+            </w:r>
+          </w:p>
+        </w:tc>
+        <w:tc>
+          <w:tcPr>
+            <w:tcW w:w="2340" w:type="dxa"/>
+            <w:vAlign w:val="center"/>
+          </w:tcPr>
+          <w:p>
+            <w:pPr>
+              <w:pStyle w:val="tablecopy"/>
+            </w:pPr>
+            <w:r>
+              <w:t xml:space="preserve">≈ 5.2 h (upper bound)</w:t>
             </w:r>
           </w:p>
         </w:tc>
@@ -899,7 +967,7 @@
           <w:highlight w:val="yellow"/>
           <w:b/>
         </w:rPr>
-        <w:t xml:space="preserve">`[TO FILL: total corpus duration in hours; mean and SD of clips per programme.]`</w:t>
+        <w:t xml:space="preserve">`[TO FILL: exact corpus duration. 626 × 30 s = 5.22 h is an upper bound, because the final fragment of each of the 47 programmes may be shorter than 30 s (a 2.0 s floor is retained), so the true figure lies between 4.85 h and 5.22 h. Sum the ffprobe durations of the source files for the exact value.]`</w:t>
       </w:r>
     </w:p>
     <w:p>

</xml_diff>

<commit_message>
Fill the exact corpus duration
5.09 h (18,312 s) from the manifest's actual_duration_sec column, inside
the 4.85-5.22 h bounds the placeholder predicted. Mean clip length is
29.25 s: 579 clips run the full 30 s and the 47 trailing fragments average
20.0 s, accounting for the 468 s shortfall against a nominal 626 x 30 s.

Co-Authored-By: Claude Opus 5 <noreply@anthropic.com>
Claude-Session: https://claude.ai/code/session_01HkkBxSJKEdB6STiXiiZ49K
</commit_message>
<xml_diff>
--- a/docs/paper/conference_paper.docx
+++ b/docs/paper/conference_paper.docx
@@ -574,10 +574,10 @@
         <w:rPr>
           <w:b/>
         </w:rPr>
-        <w:t xml:space="preserve">626 clips with zero failures</w:t>
-      </w:r>
-      <w:r>
-        <w:t xml:space="preserve">. Clip jobs run in a bounded thread pool (2 workers × 1 FFmpeg thread on a 12-CPU runtime); each worker writes to a unique partial file, validates the resulting duration and atomically publishes it, so completed clips are reused on re-runs and task completion order cannot perturb the dataset. The manifest is sorted deterministically before splitting.</w:t>
+        <w:t xml:space="preserve">626 clips totalling 5.09 h with zero failures</w:t>
+      </w:r>
+      <w:r>
+        <w:t xml:space="preserve">. Mean clip length is 29.25 s: 579 clips run the full 30 s and the 47 trailing fragments average 20.0 s. Clip jobs run in a bounded thread pool (2 workers × 1 FFmpeg thread on a 12-CPU runtime); each worker writes to a unique partial file, validates the resulting duration and atomically publishes it, so completed clips are reused on re-runs and task completion order cannot perturb the dataset. The manifest is sorted deterministically before splitting.</w:t>
       </w:r>
     </w:p>
     <w:p>
@@ -951,25 +951,12 @@
               <w:pStyle w:val="tablecopy"/>
             </w:pPr>
             <w:r>
-              <w:t xml:space="preserve">≈ 5.2 h (upper bound)</w:t>
+              <w:t xml:space="preserve">5.09 h (18,312 s; mean clip 29.25 s)</w:t>
             </w:r>
           </w:p>
         </w:tc>
       </w:tr>
     </w:tbl>
-    <w:p>
-      <w:pPr>
-        <w:pStyle w:val="BodyText"/>
-      </w:pPr>
-      <w:r>
-        <w:rPr>
-          <w:b/>
-          <w:highlight w:val="yellow"/>
-          <w:b/>
-        </w:rPr>
-        <w:t xml:space="preserve">`[TO FILL: exact corpus duration. 626 × 30 s = 5.22 h is an upper bound, because the final fragment of each of the 47 programmes may be shorter than 30 s (a 2.0 s floor is retained), so the true figure lies between 4.85 h and 5.22 h. Sum the ffprobe durations of the source files for the exact value.]`</w:t>
-      </w:r>
-    </w:p>
     <w:p>
       <w:pPr>
         <w:pStyle w:val="Heading2"/>

</xml_diff>

<commit_message>
Fill the arXiv identifiers and correct the InternVL3 author
Qwen3-VL Technical Report is arXiv:2511.21631 (Qwen Team, December 2025)
and InternVL3 is arXiv:2504.10479 (April 2025).

Looking the latter up also corrected an error: the reference credited it to
Z. Chen, but InternVL3's lead author is Jinguo Zhu. Zhe Chen leads the
earlier InternVL papers, which is where the mistake came from. Now cited as
J. Zhu et al.

Applied to both the full and 4,000-word papers.

Co-Authored-By: Claude Opus 5 <noreply@anthropic.com>
Claude-Session: https://claude.ai/code/session_01HkkBxSJKEdB6STiXiiZ49K
</commit_message>
<xml_diff>
--- a/docs/paper/conference_paper.docx
+++ b/docs/paper/conference_paper.docx
@@ -6899,15 +6899,7 @@
         <w:pStyle w:val="references"/>
       </w:pPr>
       <w:r>
-        <w:t xml:space="preserve">Qwen Team, "Qwen3-VL technical report," 2025. </w:t>
-      </w:r>
-      <w:r>
-        <w:rPr>
-          <w:b/>
-          <w:highlight w:val="yellow"/>
-          <w:b/>
-        </w:rPr>
-        <w:t xml:space="preserve">`[TO FILL: arXiv identifier]`</w:t>
+        <w:t xml:space="preserve">Qwen Team, "Qwen3-VL technical report," arXiv:2511.21631, 2025.</w:t>
       </w:r>
     </w:p>
     <w:p>
@@ -6915,7 +6907,7 @@
         <w:pStyle w:val="references"/>
       </w:pPr>
       <w:r>
-        <w:t xml:space="preserve">Z. Chen </w:t>
+        <w:t xml:space="preserve">J. Zhu </w:t>
       </w:r>
       <w:r>
         <w:rPr>
@@ -6924,15 +6916,7 @@
         <w:t xml:space="preserve">et al.</w:t>
       </w:r>
       <w:r>
-        <w:t xml:space="preserve">, "InternVL3: Exploring advanced training and test-time recipes for open-source multimodal models," 2025. </w:t>
-      </w:r>
-      <w:r>
-        <w:rPr>
-          <w:b/>
-          <w:highlight w:val="yellow"/>
-          <w:b/>
-        </w:rPr>
-        <w:t xml:space="preserve">`[TO FILL: arXiv identifier]`</w:t>
+        <w:t xml:space="preserve">, "InternVL3: Exploring advanced training and test-time recipes for open-source multimodal models," arXiv:2504.10479, 2025.</w:t>
       </w:r>
     </w:p>
     <w:p>

</xml_diff>

<commit_message>
Add four references and cite them
[21] Yousuf et al., metadata-aware retrieval-augmented generation
     (arXiv:2601.11863), cited in Implications as evidence that per-field
     structure carries downstream value.
[22] Liu et al., PPLLaVA (arXiv:2411.02327), cited in future work: the
     4-frame budget suits image-sequence models, whereas prompt-guided
     pooling is built for variable-length video.
[23] Transformers image-text-to-text documentation, cited in the benchmark
     protocol, which loads all seven models through that interface.
[24] Transformers video-text-to-text documentation, cited alongside [22].

PPLLaVA's author order comes from the authors' own BibTeX, which differs
from what a search returned. The 4,000-word paper is re-trimmed to exactly
4,000 with all eight tables still byte-identical.

Co-Authored-By: Claude Opus 5 <noreply@anthropic.com>
Claude-Session: https://claude.ai/code/session_01HkkBxSJKEdB6STiXiiZ49K
</commit_message>
<xml_diff>
--- a/docs/paper/conference_paper.docx
+++ b/docs/paper/conference_paper.docx
@@ -4465,7 +4465,7 @@
         <w:t xml:space="preserve">21,489 (model, clip, field) scores</w:t>
       </w:r>
       <w:r>
-        <w:t xml:space="preserve">. Thinking variants received a larger token budget (1400 vs 700) to accommodate their reasoning trace, and both 8B models ran int4-quantised.</w:t>
+        <w:t xml:space="preserve">. Thinking variants received a larger token budget (1400 vs 700) to accommodate their reasoning trace, and both 8B models ran int4-quantised. All seven were loaded through the Transformers image-text-to-text interface [23].</w:t>
       </w:r>
     </w:p>
     <w:p>
@@ -6405,7 +6405,7 @@
         <w:t xml:space="preserve">needs_caution</w:t>
       </w:r>
       <w:r>
-        <w:t xml:space="preserve"> records first. That is a different and more honest product than a confident automatic catalogue of unknown quality, and it is achievable with pretrained models and no annotation budget.</w:t>
+        <w:t xml:space="preserve"> records first. That is a different and more honest product than a confident automatic catalogue of unknown quality, and it is achievable with pretrained models and no annotation budget. Metadata-aware retrieval has been shown to outperform plain-text baselines on structurally repetitive corpora, with field-level ablations indicating that structural cues carry strong disambiguating signal [21], so the per-field structure published here has value beyond the catalogue record itself.</w:t>
       </w:r>
     </w:p>
     <w:p>
@@ -6647,7 +6647,7 @@
         <w:t xml:space="preserve">Future work.</w:t>
       </w:r>
       <w:r>
-        <w:t xml:space="preserve"> (i) Collect a small human-annotated reference — a few hundred clips is enough — which converts every agreement number here into a validity measurement and settles the RQ4 tag question. (ii) Replace equal family weights with measured per-source reliability, for which the provenance machinery is already in place. (iii) Add an audio-capable multimodal model to the benchmark, so the transcript column tests a model that was given the information the task requires. (iv) Scale the ablations past 8 and 5 clips. (v) Gate the ASR stage on Whisper's own language-identification output, so that a mis-identified clip is flagged rather than propagated into the transcript-derived keyword field. (vi) Test shot-boundary clip segmentation against the fixed 30-second grid. (vii) Surface the sub-clip timing the pipeline already records — Whisper segment boundaries and per-string OCR frame indices — in the published record, which needs an export change rather than new inference and would let a user land on the second rather than the half-minute. (viii) Add diarisation, which would let the transcript field carry speaker turns and would give people count a second, audio-side source to corroborate against its four visual ones.</w:t>
+        <w:t xml:space="preserve"> (i) Collect a small human-annotated reference — a few hundred clips is enough — which converts every agreement number here into a validity measurement and settles the RQ4 tag question. (ii) Replace equal family weights with measured per-source reliability, for which the provenance machinery is already in place. (iii) Add an audio-capable multimodal model to the benchmark, and a video-native one: the 4-frame budget forced here suits image-sequence models, whereas prompt-guided pooling over longer sequences [22], run through the video-text-to-text interface [24], is built for variable-length video. (iv) Scale the ablations past 8 and 5 clips. (v) Gate the ASR stage on Whisper's own language-identification output, so that a mis-identified clip is flagged rather than propagated into the transcript-derived keyword field. (vi) Test shot-boundary clip segmentation against the fixed 30-second grid. (vii) Surface the sub-clip timing the pipeline already records — Whisper segment boundaries and per-string OCR frame indices — in the published record, which needs an export change rather than new inference and would let a user land on the second rather than the half-minute. (viii) Add diarisation, which would let the transcript field carry speaker turns and would give people count a second, audio-side source to corroborate against its four visual ones.</w:t>
       </w:r>
     </w:p>
     <w:p>
@@ -7049,6 +7049,38 @@
           <w:b/>
         </w:rPr>
         <w:t xml:space="preserve">`[TO FILL: add 5–10 archival/cultural-heritage AV description references to Section II-A.]`</w:t>
+      </w:r>
+    </w:p>
+    <w:p>
+      <w:pPr>
+        <w:pStyle w:val="references"/>
+      </w:pPr>
+      <w:r>
+        <w:t xml:space="preserve">R. B. Yousuf, S. Xu, M. Sharma, A. Neeser, C. Latimer, and N. Ramakrishnan, "Utilizing metadata for better retrieval-augmented generation," arXiv:2601.11863, 2026.</w:t>
+      </w:r>
+    </w:p>
+    <w:p>
+      <w:pPr>
+        <w:pStyle w:val="references"/>
+      </w:pPr>
+      <w:r>
+        <w:t xml:space="preserve">R. Liu, H. Tang, H. Liu, Y. Ge, Y. Shan, C. Li, and J. Yang, "PPLLaVA: Varied video sequence understanding with prompt guidance," arXiv:2411.02327, 2024.</w:t>
+      </w:r>
+    </w:p>
+    <w:p>
+      <w:pPr>
+        <w:pStyle w:val="references"/>
+      </w:pPr>
+      <w:r>
+        <w:t xml:space="preserve">Hugging Face, "Image-text-to-text," Transformers documentation, 2026. [Online]. Available: https://huggingface.co/docs/transformers/tasks/image_text_to_text</w:t>
+      </w:r>
+    </w:p>
+    <w:p>
+      <w:pPr>
+        <w:pStyle w:val="references"/>
+      </w:pPr>
+      <w:r>
+        <w:t xml:space="preserve">Hugging Face, "Video-text-to-text," Transformers documentation, 2026. [Online]. Available: https://huggingface.co/docs/transformers/tasks/video_text_to_text</w:t>
       </w:r>
     </w:p>
     <w:sectPr>

</xml_diff>

<commit_message>
Record the GitLab repository and the assessed revision
The handbook requires the code on QUB EEECS GitLab with supervisor and assessor
access, and nothing in either document named it. Added in three places: the
supporting materials' front matter, so an assessor sees it without hunting;
Appendix F, where a reader looking for the code actually goes; and one sentence
in the paper's reproducibility controls.

Each carries the project URL plus the commit the submission was assessed at, so
the link survives later pushes while the revision still names exactly what was
marked.

Co-Authored-By: Claude Opus 5 <noreply@anthropic.com>
Claude-Session: https://claude.ai/code/session_01HkkBxSJKEdB6STiXiiZ49K
</commit_message>
<xml_diff>
--- a/docs/paper/conference_paper.docx
+++ b/docs/paper/conference_paper.docx
@@ -2450,7 +2450,27 @@
         <w:pStyle w:val="BodyText"/>
       </w:pPr>
       <w:r>
-        <w:t xml:space="preserve">Seeds are fixed; model revisions are resolved and recorded as commit hashes; the manifest ordering is deterministic; per-clip checkpointing makes every stage resumable; failures are recorded against their clip identifier rather than suppressed; and all artefacts are written atomically via a partial-file-and-rename discipline so an interrupted run cannot leave a truncated JSON. GPU inference on shared models is serialised while CPU OCR runs bounded-parallel, preventing CUDA contention and non-thread-safe model use.</w:t>
+        <w:t xml:space="preserve">Seeds are fixed; model revisions are resolved and recorded as commit hashes; the manifest ordering is deterministic; per-clip checkpointing makes every stage resumable; failures are recorded against their clip identifier rather than suppressed; and all artefacts are written atomically via a partial-file-and-rename discipline so an interrupted run cannot leave a truncated JSON. All code is available at </w:t>
+      </w:r>
+      <w:r>
+        <w:rPr>
+          <w:rFonts w:ascii="Consolas" w:hAnsi="Consolas"/>
+          <w:sz w:val="16"/>
+        </w:rPr>
+        <w:t xml:space="preserve">https://gitlab.eeecs.qub.ac.uk/40490925/leveraging-foundational-models-for-video-archival-data</w:t>
+      </w:r>
+      <w:r>
+        <w:t xml:space="preserve"> (revision </w:t>
+      </w:r>
+      <w:r>
+        <w:rPr>
+          <w:rFonts w:ascii="Consolas" w:hAnsi="Consolas"/>
+          <w:sz w:val="16"/>
+        </w:rPr>
+        <w:t xml:space="preserve">52977e78</w:t>
+      </w:r>
+      <w:r>
+        <w:t xml:space="preserve">). GPU inference on shared models is serialised while CPU OCR runs bounded-parallel, preventing CUDA contention and non-thread-safe model use.</w:t>
       </w:r>
     </w:p>
     <w:p>

</xml_diff>

<commit_message>
Fill the licence and ethics disclosure in both documents
Records the answer the author obtained: the collection was supplied by the
supervisory team, the project ran under the School's low-risk self-assessment,
and the hosted annotator was not separately reviewed. The disclosure is stated
plainly rather than softened -- frames from all 626 clips were transmitted, a
local-only configuration existed that would have avoided it, and the omission is
recorded rather than resolved after the fact.

Co-Authored-By: Claude Opus 5 <noreply@anthropic.com>
Claude-Session: https://claude.ai/code/session_01HkkBxSJKEdB6STiXiiZ49K
</commit_message>
<xml_diff>
--- a/docs/paper/conference_paper.docx
+++ b/docs/paper/conference_paper.docx
@@ -7876,10 +7876,11 @@
       <w:r>
         <w:rPr>
           <w:b/>
-          <w:highlight w:val="yellow"/>
-          <w:b/>
-        </w:rPr>
-        <w:t xml:space="preserve">`[TO FILL: the NVTV licence basis and the QUB ethics/data-governance reference. The reported run did use the hosted annotator — its candidate coverage on visual tags is 1.0000 across all 626 clips and it changes 49.0% of published tag sets (Section IV-F) — so state the approval under which frames were transmitted, or state that it was not separately reviewed. The supporting materials carry the full disclosure.]`</w:t>
+        </w:rPr>
+        <w:t xml:space="preserve">Licence and approval.</w:t>
+      </w:r>
+      <w:r>
+        <w:t xml:space="preserve"> The NVTV collection was supplied for this project by the supervisory team, permitting research use and publication of derived metadata. The project was reviewed under the School's low-risk self-assessment procedure; the use of a hosted third-party annotator was not separately reviewed, and frames from all 626 clips were transmitted to the hosted API during the reported run. The pipeline supports a fully local-only configuration that would have avoided this, and the omission is recorded rather than resolved retrospectively.</w:t>
       </w:r>
     </w:p>
     <w:p>

</xml_diff>